<commit_message>
Runde 9: LF8 – Stadtstaat/Flaechenland-Slicer wieder aufgenommen; zwei Jahresfilter als notwendig bestaetigt
- Neuer Slicer dim_region[stadtstaat] (Mehrfachauswahl) rechts am Streudiagramm -> Confounder umschaltbar; live geprueft: Flaechenland gewaehlt -> 13 Punkte, Trendlinie kippt auf r<0; Auswahl geloescht -> alle 16
- Zwei Jahresfilter geprueft und bewusst behalten (NICHT redundant): X=fact_ausgaben_je_schueler[jahr]=2023 (Quelle 2010-2024, keine dim_zeit-Beziehung) + Y=fact_abgaenge[jahr]=2023 (2022/23); nur letztere haengt an dim_zeit -> nicht zu einem Filter konsolidierbar
- pbi_lf8.png neu gecroppt (mit Slicer); .pbix + bericht.pdf neu exportiert; DOCX/README/visual_spezifikation ergaenzt
- verify_all 110/110 (neuer LF8-Regressionsguard: Slicer + 2 Jahresfilter)

Co-Authored-By: Claude Fable 5 <noreply@anthropic.com>
</commit_message>
<xml_diff>
--- a/Schulabschluss_DataStory_Dokumentation.docx
+++ b/Schulabschluss_DataStory_Dokumentation.docx
@@ -3552,7 +3552,7 @@
       <w:r>
         <w:drawing>
           <wp:inline xmlns:a="http://schemas.openxmlformats.org/drawingml/2006/main" xmlns:pic="http://schemas.openxmlformats.org/drawingml/2006/picture">
-            <wp:extent cx="5760720" cy="3759830"/>
+            <wp:extent cx="5760720" cy="3184788"/>
             <wp:docPr id="9" name="Picture 9"/>
             <wp:cNvGraphicFramePr>
               <a:graphicFrameLocks noChangeAspect="1"/>
@@ -3573,7 +3573,7 @@
                   <pic:spPr>
                     <a:xfrm>
                       <a:off x="0" y="0"/>
-                      <a:ext cx="5760720" cy="3759830"/>
+                      <a:ext cx="5760720" cy="3184788"/>
                     </a:xfrm>
                     <a:prstGeom prst="rect"/>
                   </pic:spPr>
@@ -3594,7 +3594,7 @@
           <w:color w:val="666666"/>
           <w:sz w:val="18"/>
         </w:rPr>
-        <w:t>Abb. 9 (LF8): Berichtsseite LF8 – Ausgaben je Schüler und Abiturquote je Bundesland (2023). Die Stadtstaaten sind farblich abgesetzt; sie treiben die scheinbar positive Trendlinie.</w:t>
+        <w:t>Abb. 9 (LF8): Berichtsseite LF8 – Ausgaben je Schüler und Abiturquote je Bundesland (2023). Die Stadtstaaten sind farblich abgesetzt; sie treiben die scheinbar positive Trendlinie. Ein Stadtstaat/Flächenland-Slicer blendet Gruppen aus und macht den Confounder umschaltbar.</w:t>
       </w:r>
     </w:p>
     <w:p>
@@ -3609,7 +3609,7 @@
         <w:rPr>
           <w:sz w:val="22"/>
         </w:rPr>
-        <w:t>Dieser Eindruck ist ein Stadtstaaten-Artefakt. Berlin, Hamburg und Bremen verbinden struktur- und stadtbedingt hohe Ausgaben mit hohen Abiturquoten und ziehen die Trendlinie nach oben. Nimmt man die drei Stadtstaaten heraus, dreht der Zusammenhang unter den 13 Flächenländern ins Negative (r = −0,36) und ist nicht mehr signifikant. Wir haben die Punkte deshalb im Live-Visual nach Stadtstaat und Flächenland eingefärbt, damit dieser Effekt unmittelbar sichtbar wird.</w:t>
+        <w:t>Dieser Eindruck ist ein Stadtstaaten-Artefakt. Berlin, Hamburg und Bremen verbinden struktur- und stadtbedingt hohe Ausgaben mit hohen Abiturquoten und ziehen die Trendlinie nach oben. Nimmt man die drei Stadtstaaten heraus, dreht der Zusammenhang unter den 13 Flächenländern ins Negative (r = −0,36) und ist nicht mehr signifikant. Wir haben die Punkte deshalb im Live-Visual nach Stadtstaat und Flächenland eingefärbt und einen Stadtstaat/Flächenland-Slicer ergänzt: Blendet man die drei Stadtstaaten aus, kippt die Trendlinie im Bericht unmittelbar sichtbar ins Negative. Beide Achsen sind über getrennte Jahresfilter fest auf 2023 gepinnt – einen für die Ausgaben-Quelle (die die Jahre 2010–2024 enthält) und einen für die Abgänge-Quelle (2022/2023); da nur letztere an der Zeit-Dimension hängt, sind zwei Filter nötig und nicht redundant.</w:t>
       </w:r>
     </w:p>
     <w:p>

</xml_diff>